<commit_message>
Refine report contact details
</commit_message>
<xml_diff>
--- a/docs/reports/SmartLibraryOntology_Project_Report_v2.docx
+++ b/docs/reports/SmartLibraryOntology_Project_Report_v2.docx
@@ -20,17 +20,17 @@
     </w:p>
     <w:p>
       <w:r>
-        <w:t>- Kemal Mert Ceyhan - kemalmertceyhan@example.edu</w:t>
-      </w:r>
-    </w:p>
-    <w:p>
-      <w:r>
-        <w:t>- Ahmet Burak Guvercin - ahmetburakguvercin@example.edu</w:t>
-      </w:r>
-    </w:p>
-    <w:p>
-      <w:r>
-        <w:t>- Khaled ALISMAIL - khaledalismail@example.edu</w:t>
+        <w:t>- Kemal Mert Ceyhan - kemal2002mert@gmail.com</w:t>
+      </w:r>
+    </w:p>
+    <w:p>
+      <w:r>
+        <w:t>- Ahmet Burak Guvercin - to be confirmed by team</w:t>
+      </w:r>
+    </w:p>
+    <w:p>
+      <w:r>
+        <w:t>- Khaled ALISMAIL - to be confirmed by team</w:t>
       </w:r>
     </w:p>
     <w:p>

</xml_diff>